<commit_message>
fix(tours): Signature 4 tours — hotels all 5-star, trains First Class
Word itineraries: Turpan/Yangshuo hotel stars to 5-star, summary line to 5-star.
Website data: grand-tour hotels synced to the Word itinerary (5-star).

Co-Authored-By: Claude Sonnet 5.5 <noreply@anthropic.com>
</commit_message>
<xml_diff>
--- a/tours/2027/2027 - China Panorama-27D.docx
+++ b/tours/2027/2027 - China Panorama-27D.docx
@@ -1887,7 +1887,7 @@
         <w:rPr>
           <w:rFonts w:hint="default" w:ascii="Times New Roman" w:hAnsi="Times New Roman" w:cs="Times New Roman"/>
         </w:rPr>
-        <w:t>Licheng Yitian West Street Hotel Yangshuo or similar 4.5-star accommodation</w:t>
+        <w:t>Licheng Yitian West Street Hotel Yangshuo or similar 5-star accommodation</w:t>
       </w:r>
     </w:p>
     <w:p>
@@ -2033,7 +2033,7 @@
         <w:rPr>
           <w:rFonts w:hint="default" w:ascii="Times New Roman" w:hAnsi="Times New Roman" w:cs="Times New Roman"/>
         </w:rPr>
-        <w:t>Licheng Yitian West Street Hotel Yangshuo or similar 4.5-star accommodation</w:t>
+        <w:t>Licheng Yitian West Street Hotel Yangshuo or similar 5-star accommodation</w:t>
       </w:r>
     </w:p>
     <w:p>

</xml_diff>